<commit_message>
feat: configure unified production build for 1-click cloud deployment
</commit_message>
<xml_diff>
--- a/FullStack_Mentorship_Guide.docx
+++ b/FullStack_Mentorship_Guide.docx
@@ -1429,6 +1429,105 @@
         <w:spacing w:after="180" w:before="360"/>
       </w:pPr>
       <w:r>
+        <w:t xml:space="preserve">Module 11: Unified Modal Architecture &amp; Full CRUD Lifecycle</w:t>
+      </w:r>
+    </w:p>
+    <w:p>
+      <w:pPr>
+        <w:spacing w:after="120" w:line="276"/>
+      </w:pPr>
+      <w:r>
+        <w:rPr>
+          <w:sz w:val="22"/>
+          <w:szCs w:val="22"/>
+        </w:rPr>
+        <w:t xml:space="preserve">Completing the full CRUD contract with clean, reusable components and device-adaptive triggers.</w:t>
+      </w:r>
+    </w:p>
+    <w:p>
+      <w:pPr>
+        <w:pStyle w:val="ListParagraph"/>
+        <w:numPr>
+          <w:ilvl w:val="0"/>
+          <w:numId w:val="1"/>
+        </w:numPr>
+        <w:spacing w:after="80" w:line="260"/>
+      </w:pPr>
+      <w:r>
+        <w:rPr>
+          <w:b/>
+          <w:bCs/>
+          <w:sz w:val="22"/>
+          <w:szCs w:val="22"/>
+        </w:rPr>
+        <w:t xml:space="preserve">Unified Modal Pattern: </w:t>
+      </w:r>
+      <w:r>
+        <w:rPr>
+          <w:sz w:val="22"/>
+          <w:szCs w:val="22"/>
+        </w:rPr>
+        <w:t xml:space="preserve">Instead of duplicating modal markup, a single TaskModal adapts based on editingTask state (blank for create, prepopulated for edit), calling POST or PUT accordingly.</w:t>
+      </w:r>
+    </w:p>
+    <w:p>
+      <w:pPr>
+        <w:pStyle w:val="ListParagraph"/>
+        <w:numPr>
+          <w:ilvl w:val="0"/>
+          <w:numId w:val="1"/>
+        </w:numPr>
+        <w:spacing w:after="80" w:line="260"/>
+      </w:pPr>
+      <w:r>
+        <w:rPr>
+          <w:b/>
+          <w:bCs/>
+          <w:sz w:val="22"/>
+          <w:szCs w:val="22"/>
+        </w:rPr>
+        <w:t xml:space="preserve">Event Propagation &amp; Ergonomics: </w:t>
+      </w:r>
+      <w:r>
+        <w:rPr>
+          <w:sz w:val="22"/>
+          <w:szCs w:val="22"/>
+        </w:rPr>
+        <w:t xml:space="preserve">Single-clicking a card body or the footer pencil icon opens the edit modal, while move arrows call e.stopPropagation() so quick moves never accidentally pop open the modal.</w:t>
+      </w:r>
+    </w:p>
+    <w:p>
+      <w:pPr>
+        <w:pStyle w:val="ListParagraph"/>
+        <w:numPr>
+          <w:ilvl w:val="0"/>
+          <w:numId w:val="1"/>
+        </w:numPr>
+        <w:spacing w:after="80" w:line="260"/>
+      </w:pPr>
+      <w:r>
+        <w:rPr>
+          <w:b/>
+          <w:bCs/>
+          <w:sz w:val="22"/>
+          <w:szCs w:val="22"/>
+        </w:rPr>
+        <w:t xml:space="preserve">Mobile Drawer Integration: </w:t>
+      </w:r>
+      <w:r>
+        <w:rPr>
+          <w:sz w:val="22"/>
+          <w:szCs w:val="22"/>
+        </w:rPr>
+        <w:t xml:space="preserve">On smartphones, tapping a card opens the slide-up Action Drawer with a dedicated "Edit Task Details" button leading into the modal.</w:t>
+      </w:r>
+    </w:p>
+    <w:p>
+      <w:pPr>
+        <w:pStyle w:val="Heading1"/>
+        <w:spacing w:after="180" w:before="360"/>
+      </w:pPr>
+      <w:r>
         <w:t xml:space="preserve">Current Project: Kanban Task Management Dashboard</w:t>
       </w:r>
     </w:p>
@@ -1572,6 +1671,32 @@
           <w:szCs w:val="22"/>
         </w:rPr>
         <w:t xml:space="preserve">Linear design system, HTML5 drag-and-drop, mobile segmented tab navigation, bottom sheet drawer, keyboard shortcuts, and PWA installability. [Status: Completed]</w:t>
+      </w:r>
+    </w:p>
+    <w:p>
+      <w:pPr>
+        <w:pStyle w:val="ListParagraph"/>
+        <w:numPr>
+          <w:ilvl w:val="0"/>
+          <w:numId w:val="1"/>
+        </w:numPr>
+        <w:spacing w:after="80" w:line="260"/>
+      </w:pPr>
+      <w:r>
+        <w:rPr>
+          <w:b/>
+          <w:bCs/>
+          <w:sz w:val="22"/>
+          <w:szCs w:val="22"/>
+        </w:rPr>
+        <w:t xml:space="preserve">Phase 1F: Full Task Editing: </w:t>
+      </w:r>
+      <w:r>
+        <w:rPr>
+          <w:sz w:val="22"/>
+          <w:szCs w:val="22"/>
+        </w:rPr>
+        <w:t xml:space="preserve">Unified modal for Create &amp; Edit, card click triggers, dedicated pencil buttons, and optimistic state synchronization. [Status: Completed]</w:t>
       </w:r>
     </w:p>
     <w:p>

</xml_diff>